<commit_message>
Updated SRS and NonF Reqs
</commit_message>
<xml_diff>
--- a/Homework 01 - Project Intro and SRS.docx
+++ b/Homework 01 - Project Intro and SRS.docx
@@ -516,7 +516,6 @@
         </w:rPr>
         <w:t xml:space="preserve">3.1 </w:t>
       </w:r>
-      <w:proofErr w:type="spellStart"/>
       <w:r>
         <w:rPr>
           <w:b/>
@@ -524,44 +523,22 @@
         </w:rPr>
         <w:t>SpotHero</w:t>
       </w:r>
-      <w:proofErr w:type="spellEnd"/>
-    </w:p>
-    <w:p>
-      <w:proofErr w:type="spellStart"/>
-      <w:r>
-        <w:t>SpotHero</w:t>
-      </w:r>
-      <w:proofErr w:type="spellEnd"/>
-      <w:r>
-        <w:t xml:space="preserve"> allows drivers to search for parking by destination and time, compare</w:t>
+    </w:p>
+    <w:p>
+      <w:r>
+        <w:t>SpotHero allows drivers to search for parking by destination and time, compare</w:t>
       </w:r>
       <w:r>
         <w:t xml:space="preserve"> locations and prices, reserve and prepay for parking, and access parking passes through its app.</w:t>
       </w:r>
       <w:r>
-        <w:t xml:space="preserve"> It supports hourly, monthly, airport, event, and other use cases. </w:t>
-      </w:r>
-      <w:proofErr w:type="spellStart"/>
-      <w:r>
-        <w:t>SpotHero</w:t>
-      </w:r>
-      <w:proofErr w:type="spellEnd"/>
-      <w:r>
-        <w:t xml:space="preserve"> says it operates across more than 400 cities in the United States and Canada.</w:t>
+        <w:t xml:space="preserve"> It supports hourly, monthly, airport, event, and other use cases. SpotHero says it operates across more than 400 cities in the United States and Canada.</w:t>
       </w:r>
     </w:p>
     <w:p/>
     <w:p>
       <w:r>
-        <w:t xml:space="preserve">Strengths: </w:t>
-      </w:r>
-      <w:proofErr w:type="spellStart"/>
-      <w:r>
-        <w:t>SpotHero</w:t>
-      </w:r>
-      <w:proofErr w:type="spellEnd"/>
-      <w:r>
-        <w:t xml:space="preserve"> has a large network, a straightforward reservation process, price comparison, guaranteed reservations, flexible cancellation, and substantial market experience.</w:t>
+        <w:t>Strengths: SpotHero has a large network, a straightforward reservation process, price comparison, guaranteed reservations, flexible cancellation, and substantial market experience.</w:t>
       </w:r>
     </w:p>
     <w:p/>
@@ -596,26 +573,12 @@
           <w:b/>
           <w:bCs/>
         </w:rPr>
-        <w:t xml:space="preserve"> </w:t>
-      </w:r>
-      <w:proofErr w:type="spellStart"/>
-      <w:r>
-        <w:rPr>
-          <w:b/>
-          <w:bCs/>
-        </w:rPr>
-        <w:t>ParkWhiz</w:t>
-      </w:r>
-      <w:proofErr w:type="spellEnd"/>
-    </w:p>
-    <w:p>
-      <w:proofErr w:type="spellStart"/>
-      <w:r>
-        <w:t>ParkWhiz</w:t>
-      </w:r>
-      <w:proofErr w:type="spellEnd"/>
-      <w:r>
-        <w:t xml:space="preserve"> allows customers to search for parking by location, venue, date, and time and then compare and</w:t>
+        <w:t xml:space="preserve"> ParkWhiz</w:t>
+      </w:r>
+    </w:p>
+    <w:p>
+      <w:r>
+        <w:t>ParkWhiz allows customers to search for parking by location, venue, date, and time and then compare and</w:t>
       </w:r>
       <w:r>
         <w:t xml:space="preserve"> reserve available parking. Its booking process provides facility information such as amenities and vehicle height restrictions before the customer pays, </w:t>
@@ -630,15 +593,7 @@
         <w:t>in the user’s account.</w:t>
       </w:r>
       <w:r>
-        <w:t xml:space="preserve"> </w:t>
-      </w:r>
-      <w:proofErr w:type="spellStart"/>
-      <w:r>
-        <w:t>ParkWhiz</w:t>
-      </w:r>
-      <w:proofErr w:type="spellEnd"/>
-      <w:r>
-        <w:t xml:space="preserve"> also offers operator-oriented reservation technology, including transient, event, and monthly </w:t>
+        <w:t xml:space="preserve"> ParkWhiz also offers operator-oriented reservation technology, including transient, event, and monthly </w:t>
       </w:r>
       <w:r>
         <w:t>parking capabilities.</w:t>
@@ -714,7 +669,13 @@
         <w:t xml:space="preserve">of the Smart </w:t>
       </w:r>
       <w:r>
-        <w:t xml:space="preserve">Parking Platform. This version represents initial requirements available during project kickoff and will be expanded and refined </w:t>
+        <w:t xml:space="preserve">Parking Platform. This version represents </w:t>
+      </w:r>
+      <w:r>
+        <w:t>requirements identified during project kickoff and refined throughout project planning.</w:t>
+      </w:r>
+      <w:r>
+        <w:t xml:space="preserve"> and will be expanded and refined </w:t>
       </w:r>
       <w:r>
         <w:t>as stakeholder analysis continues.</w:t>
@@ -741,7 +702,25 @@
         <w:t xml:space="preserve">Initial system actors include </w:t>
       </w:r>
       <w:r>
-        <w:t>drivers, parking facility operators, system administrators, finance and billing personnel, mobile application users, and third-party payment providers.</w:t>
+        <w:t>drivers</w:t>
+      </w:r>
+      <w:r>
+        <w:t xml:space="preserve"> (including mobile users)</w:t>
+      </w:r>
+      <w:r>
+        <w:t>, parking facility operators, system administrators, finance and billing personnel, mobile application users, and third-party payment providers</w:t>
+      </w:r>
+      <w:r>
+        <w:t xml:space="preserve"> (</w:t>
+      </w:r>
+      <w:r>
+        <w:t xml:space="preserve">external </w:t>
+      </w:r>
+      <w:r>
+        <w:t>support)</w:t>
+      </w:r>
+      <w:r>
+        <w:t>.</w:t>
       </w:r>
     </w:p>
     <w:p/>
@@ -757,7 +736,14 @@
           <w:b/>
           <w:bCs/>
         </w:rPr>
-        <w:t>4.3 Initial Use Cases</w:t>
+        <w:t xml:space="preserve">4.3 </w:t>
+      </w:r>
+      <w:r>
+        <w:rPr>
+          <w:b/>
+          <w:bCs/>
+        </w:rPr>
+        <w:t>Functional Requirements and Use Cases</w:t>
       </w:r>
     </w:p>
     <w:tbl>
@@ -779,7 +765,7 @@
         <w:tc>
           <w:tcPr>
             <w:cnfStyle w:val="001000000000" w:firstRow="0" w:lastRow="0" w:firstColumn="1" w:lastColumn="0" w:oddVBand="0" w:evenVBand="0" w:oddHBand="0" w:evenHBand="0" w:firstRowFirstColumn="0" w:firstRowLastColumn="0" w:lastRowFirstColumn="0" w:lastRowLastColumn="0"/>
-            <w:tcW w:w="2337" w:type="dxa"/>
+            <w:tcW w:w="2203" w:type="dxa"/>
           </w:tcPr>
           <w:p>
             <w:r>
@@ -789,7 +775,7 @@
         </w:tc>
         <w:tc>
           <w:tcPr>
-            <w:tcW w:w="2337" w:type="dxa"/>
+            <w:tcW w:w="2271" w:type="dxa"/>
           </w:tcPr>
           <w:p>
             <w:pPr>
@@ -802,7 +788,7 @@
         </w:tc>
         <w:tc>
           <w:tcPr>
-            <w:tcW w:w="2338" w:type="dxa"/>
+            <w:tcW w:w="2285" w:type="dxa"/>
           </w:tcPr>
           <w:p>
             <w:pPr>
@@ -815,7 +801,7 @@
         </w:tc>
         <w:tc>
           <w:tcPr>
-            <w:tcW w:w="2338" w:type="dxa"/>
+            <w:tcW w:w="2591" w:type="dxa"/>
           </w:tcPr>
           <w:p>
             <w:pPr>
@@ -831,7 +817,7 @@
         <w:tc>
           <w:tcPr>
             <w:cnfStyle w:val="001000000000" w:firstRow="0" w:lastRow="0" w:firstColumn="1" w:lastColumn="0" w:oddVBand="0" w:evenVBand="0" w:oddHBand="0" w:evenHBand="0" w:firstRowFirstColumn="0" w:firstRowLastColumn="0" w:lastRowFirstColumn="0" w:lastRowLastColumn="0"/>
-            <w:tcW w:w="2337" w:type="dxa"/>
+            <w:tcW w:w="2203" w:type="dxa"/>
           </w:tcPr>
           <w:p>
             <w:pPr>
@@ -851,7 +837,7 @@
         </w:tc>
         <w:tc>
           <w:tcPr>
-            <w:tcW w:w="2337" w:type="dxa"/>
+            <w:tcW w:w="2271" w:type="dxa"/>
           </w:tcPr>
           <w:p>
             <w:pPr>
@@ -864,7 +850,7 @@
         </w:tc>
         <w:tc>
           <w:tcPr>
-            <w:tcW w:w="2338" w:type="dxa"/>
+            <w:tcW w:w="2285" w:type="dxa"/>
           </w:tcPr>
           <w:p>
             <w:pPr>
@@ -877,7 +863,7 @@
         </w:tc>
         <w:tc>
           <w:tcPr>
-            <w:tcW w:w="2338" w:type="dxa"/>
+            <w:tcW w:w="2591" w:type="dxa"/>
           </w:tcPr>
           <w:p>
             <w:pPr>
@@ -893,7 +879,7 @@
         <w:tc>
           <w:tcPr>
             <w:cnfStyle w:val="001000000000" w:firstRow="0" w:lastRow="0" w:firstColumn="1" w:lastColumn="0" w:oddVBand="0" w:evenVBand="0" w:oddHBand="0" w:evenHBand="0" w:firstRowFirstColumn="0" w:firstRowLastColumn="0" w:lastRowFirstColumn="0" w:lastRowLastColumn="0"/>
-            <w:tcW w:w="2337" w:type="dxa"/>
+            <w:tcW w:w="2203" w:type="dxa"/>
           </w:tcPr>
           <w:p>
             <w:pPr>
@@ -913,7 +899,7 @@
         </w:tc>
         <w:tc>
           <w:tcPr>
-            <w:tcW w:w="2337" w:type="dxa"/>
+            <w:tcW w:w="2271" w:type="dxa"/>
           </w:tcPr>
           <w:p>
             <w:pPr>
@@ -926,7 +912,7 @@
         </w:tc>
         <w:tc>
           <w:tcPr>
-            <w:tcW w:w="2338" w:type="dxa"/>
+            <w:tcW w:w="2285" w:type="dxa"/>
           </w:tcPr>
           <w:p>
             <w:pPr>
@@ -939,7 +925,7 @@
         </w:tc>
         <w:tc>
           <w:tcPr>
-            <w:tcW w:w="2338" w:type="dxa"/>
+            <w:tcW w:w="2591" w:type="dxa"/>
           </w:tcPr>
           <w:p>
             <w:pPr>
@@ -955,7 +941,7 @@
         <w:tc>
           <w:tcPr>
             <w:cnfStyle w:val="001000000000" w:firstRow="0" w:lastRow="0" w:firstColumn="1" w:lastColumn="0" w:oddVBand="0" w:evenVBand="0" w:oddHBand="0" w:evenHBand="0" w:firstRowFirstColumn="0" w:firstRowLastColumn="0" w:lastRowFirstColumn="0" w:lastRowLastColumn="0"/>
-            <w:tcW w:w="2337" w:type="dxa"/>
+            <w:tcW w:w="2203" w:type="dxa"/>
           </w:tcPr>
           <w:p>
             <w:pPr>
@@ -975,7 +961,7 @@
         </w:tc>
         <w:tc>
           <w:tcPr>
-            <w:tcW w:w="2337" w:type="dxa"/>
+            <w:tcW w:w="2271" w:type="dxa"/>
           </w:tcPr>
           <w:p>
             <w:pPr>
@@ -988,7 +974,7 @@
         </w:tc>
         <w:tc>
           <w:tcPr>
-            <w:tcW w:w="2338" w:type="dxa"/>
+            <w:tcW w:w="2285" w:type="dxa"/>
           </w:tcPr>
           <w:p>
             <w:pPr>
@@ -1001,7 +987,7 @@
         </w:tc>
         <w:tc>
           <w:tcPr>
-            <w:tcW w:w="2338" w:type="dxa"/>
+            <w:tcW w:w="2591" w:type="dxa"/>
           </w:tcPr>
           <w:p>
             <w:pPr>
@@ -1017,7 +1003,7 @@
         <w:tc>
           <w:tcPr>
             <w:cnfStyle w:val="001000000000" w:firstRow="0" w:lastRow="0" w:firstColumn="1" w:lastColumn="0" w:oddVBand="0" w:evenVBand="0" w:oddHBand="0" w:evenHBand="0" w:firstRowFirstColumn="0" w:firstRowLastColumn="0" w:lastRowFirstColumn="0" w:lastRowLastColumn="0"/>
-            <w:tcW w:w="2337" w:type="dxa"/>
+            <w:tcW w:w="2203" w:type="dxa"/>
           </w:tcPr>
           <w:p>
             <w:pPr>
@@ -1037,7 +1023,7 @@
         </w:tc>
         <w:tc>
           <w:tcPr>
-            <w:tcW w:w="2337" w:type="dxa"/>
+            <w:tcW w:w="2271" w:type="dxa"/>
           </w:tcPr>
           <w:p>
             <w:pPr>
@@ -1053,7 +1039,7 @@
         </w:tc>
         <w:tc>
           <w:tcPr>
-            <w:tcW w:w="2338" w:type="dxa"/>
+            <w:tcW w:w="2285" w:type="dxa"/>
           </w:tcPr>
           <w:p>
             <w:pPr>
@@ -1066,7 +1052,7 @@
         </w:tc>
         <w:tc>
           <w:tcPr>
-            <w:tcW w:w="2338" w:type="dxa"/>
+            <w:tcW w:w="2591" w:type="dxa"/>
           </w:tcPr>
           <w:p>
             <w:pPr>
@@ -1082,7 +1068,7 @@
         <w:tc>
           <w:tcPr>
             <w:cnfStyle w:val="001000000000" w:firstRow="0" w:lastRow="0" w:firstColumn="1" w:lastColumn="0" w:oddVBand="0" w:evenVBand="0" w:oddHBand="0" w:evenHBand="0" w:firstRowFirstColumn="0" w:firstRowLastColumn="0" w:lastRowFirstColumn="0" w:lastRowLastColumn="0"/>
-            <w:tcW w:w="2337" w:type="dxa"/>
+            <w:tcW w:w="2203" w:type="dxa"/>
           </w:tcPr>
           <w:p>
             <w:pPr>
@@ -1102,7 +1088,7 @@
         </w:tc>
         <w:tc>
           <w:tcPr>
-            <w:tcW w:w="2337" w:type="dxa"/>
+            <w:tcW w:w="2271" w:type="dxa"/>
           </w:tcPr>
           <w:p>
             <w:pPr>
@@ -1115,7 +1101,7 @@
         </w:tc>
         <w:tc>
           <w:tcPr>
-            <w:tcW w:w="2338" w:type="dxa"/>
+            <w:tcW w:w="2285" w:type="dxa"/>
           </w:tcPr>
           <w:p>
             <w:pPr>
@@ -1128,7 +1114,7 @@
         </w:tc>
         <w:tc>
           <w:tcPr>
-            <w:tcW w:w="2338" w:type="dxa"/>
+            <w:tcW w:w="2591" w:type="dxa"/>
           </w:tcPr>
           <w:p>
             <w:pPr>
@@ -1144,72 +1130,7 @@
         <w:tc>
           <w:tcPr>
             <w:cnfStyle w:val="001000000000" w:firstRow="0" w:lastRow="0" w:firstColumn="1" w:lastColumn="0" w:oddVBand="0" w:evenVBand="0" w:oddHBand="0" w:evenHBand="0" w:firstRowFirstColumn="0" w:firstRowLastColumn="0" w:lastRowFirstColumn="0" w:lastRowLastColumn="0"/>
-            <w:tcW w:w="2337" w:type="dxa"/>
-          </w:tcPr>
-          <w:p>
-            <w:pPr>
-              <w:rPr>
-                <w:b w:val="0"/>
-                <w:bCs w:val="0"/>
-              </w:rPr>
-            </w:pPr>
-            <w:r>
-              <w:rPr>
-                <w:b w:val="0"/>
-                <w:bCs w:val="0"/>
-              </w:rPr>
-              <w:t>UC-06</w:t>
-            </w:r>
-          </w:p>
-        </w:tc>
-        <w:tc>
-          <w:tcPr>
-            <w:tcW w:w="2337" w:type="dxa"/>
-          </w:tcPr>
-          <w:p>
-            <w:pPr>
-              <w:cnfStyle w:val="000000000000" w:firstRow="0" w:lastRow="0" w:firstColumn="0" w:lastColumn="0" w:oddVBand="0" w:evenVBand="0" w:oddHBand="0" w:evenHBand="0" w:firstRowFirstColumn="0" w:firstRowLastColumn="0" w:lastRowFirstColumn="0" w:lastRowLastColumn="0"/>
-            </w:pPr>
-            <w:r>
-              <w:t>View real-time availability</w:t>
-            </w:r>
-          </w:p>
-        </w:tc>
-        <w:tc>
-          <w:tcPr>
-            <w:tcW w:w="2338" w:type="dxa"/>
-          </w:tcPr>
-          <w:p>
-            <w:pPr>
-              <w:cnfStyle w:val="000000000000" w:firstRow="0" w:lastRow="0" w:firstColumn="0" w:lastColumn="0" w:oddVBand="0" w:evenVBand="0" w:oddHBand="0" w:evenHBand="0" w:firstRowFirstColumn="0" w:firstRowLastColumn="0" w:lastRowFirstColumn="0" w:lastRowLastColumn="0"/>
-            </w:pPr>
-            <w:r>
-              <w:t>Driver</w:t>
-            </w:r>
-          </w:p>
-        </w:tc>
-        <w:tc>
-          <w:tcPr>
-            <w:tcW w:w="2338" w:type="dxa"/>
-          </w:tcPr>
-          <w:p>
-            <w:pPr>
-              <w:cnfStyle w:val="000000000000" w:firstRow="0" w:lastRow="0" w:firstColumn="0" w:lastColumn="0" w:oddVBand="0" w:evenVBand="0" w:oddHBand="0" w:evenHBand="0" w:firstRowFirstColumn="0" w:firstRowLastColumn="0" w:lastRowFirstColumn="0" w:lastRowLastColumn="0"/>
-            </w:pPr>
-            <w:r>
-              <w:t>Driver views currently parking at facilities</w:t>
-            </w:r>
-            <w:r>
-              <w:t>.</w:t>
-            </w:r>
-          </w:p>
-        </w:tc>
-      </w:tr>
-      <w:tr>
-        <w:tc>
-          <w:tcPr>
-            <w:cnfStyle w:val="001000000000" w:firstRow="0" w:lastRow="0" w:firstColumn="1" w:lastColumn="0" w:oddVBand="0" w:evenVBand="0" w:oddHBand="0" w:evenHBand="0" w:firstRowFirstColumn="0" w:firstRowLastColumn="0" w:lastRowFirstColumn="0" w:lastRowLastColumn="0"/>
-            <w:tcW w:w="2337" w:type="dxa"/>
+            <w:tcW w:w="2203" w:type="dxa"/>
           </w:tcPr>
           <w:p>
             <w:pPr>
@@ -1224,26 +1145,26 @@
                 <w:bCs w:val="0"/>
               </w:rPr>
               <w:lastRenderedPageBreak/>
-              <w:t>UC-07</w:t>
-            </w:r>
-          </w:p>
-        </w:tc>
-        <w:tc>
-          <w:tcPr>
-            <w:tcW w:w="2337" w:type="dxa"/>
-          </w:tcPr>
-          <w:p>
-            <w:pPr>
-              <w:cnfStyle w:val="000000000000" w:firstRow="0" w:lastRow="0" w:firstColumn="0" w:lastColumn="0" w:oddVBand="0" w:evenVBand="0" w:oddHBand="0" w:evenHBand="0" w:firstRowFirstColumn="0" w:firstRowLastColumn="0" w:lastRowFirstColumn="0" w:lastRowLastColumn="0"/>
-            </w:pPr>
-            <w:r>
-              <w:t>View parking on interactive map</w:t>
-            </w:r>
-          </w:p>
-        </w:tc>
-        <w:tc>
-          <w:tcPr>
-            <w:tcW w:w="2338" w:type="dxa"/>
+              <w:t>UC-06</w:t>
+            </w:r>
+          </w:p>
+        </w:tc>
+        <w:tc>
+          <w:tcPr>
+            <w:tcW w:w="2271" w:type="dxa"/>
+          </w:tcPr>
+          <w:p>
+            <w:pPr>
+              <w:cnfStyle w:val="000000000000" w:firstRow="0" w:lastRow="0" w:firstColumn="0" w:lastColumn="0" w:oddVBand="0" w:evenVBand="0" w:oddHBand="0" w:evenHBand="0" w:firstRowFirstColumn="0" w:firstRowLastColumn="0" w:lastRowFirstColumn="0" w:lastRowLastColumn="0"/>
+            </w:pPr>
+            <w:r>
+              <w:t>View real-time availability</w:t>
+            </w:r>
+          </w:p>
+        </w:tc>
+        <w:tc>
+          <w:tcPr>
+            <w:tcW w:w="2285" w:type="dxa"/>
           </w:tcPr>
           <w:p>
             <w:pPr>
@@ -1256,14 +1177,17 @@
         </w:tc>
         <w:tc>
           <w:tcPr>
-            <w:tcW w:w="2338" w:type="dxa"/>
-          </w:tcPr>
-          <w:p>
-            <w:pPr>
-              <w:cnfStyle w:val="000000000000" w:firstRow="0" w:lastRow="0" w:firstColumn="0" w:lastColumn="0" w:oddVBand="0" w:evenVBand="0" w:oddHBand="0" w:evenHBand="0" w:firstRowFirstColumn="0" w:firstRowLastColumn="0" w:lastRowFirstColumn="0" w:lastRowLastColumn="0"/>
-            </w:pPr>
-            <w:r>
-              <w:t>Driver views parking facilities and availability on a map.</w:t>
+            <w:tcW w:w="2591" w:type="dxa"/>
+          </w:tcPr>
+          <w:p>
+            <w:pPr>
+              <w:cnfStyle w:val="000000000000" w:firstRow="0" w:lastRow="0" w:firstColumn="0" w:lastColumn="0" w:oddVBand="0" w:evenVBand="0" w:oddHBand="0" w:evenHBand="0" w:firstRowFirstColumn="0" w:firstRowLastColumn="0" w:lastRowFirstColumn="0" w:lastRowLastColumn="0"/>
+            </w:pPr>
+            <w:r>
+              <w:t>Driver views current parking at facilities</w:t>
+            </w:r>
+            <w:r>
+              <w:t>.</w:t>
             </w:r>
           </w:p>
         </w:tc>
@@ -1272,7 +1196,69 @@
         <w:tc>
           <w:tcPr>
             <w:cnfStyle w:val="001000000000" w:firstRow="0" w:lastRow="0" w:firstColumn="1" w:lastColumn="0" w:oddVBand="0" w:evenVBand="0" w:oddHBand="0" w:evenHBand="0" w:firstRowFirstColumn="0" w:firstRowLastColumn="0" w:lastRowFirstColumn="0" w:lastRowLastColumn="0"/>
-            <w:tcW w:w="2337" w:type="dxa"/>
+            <w:tcW w:w="2203" w:type="dxa"/>
+          </w:tcPr>
+          <w:p>
+            <w:pPr>
+              <w:rPr>
+                <w:b w:val="0"/>
+                <w:bCs w:val="0"/>
+              </w:rPr>
+            </w:pPr>
+            <w:r>
+              <w:rPr>
+                <w:b w:val="0"/>
+                <w:bCs w:val="0"/>
+              </w:rPr>
+              <w:t>UC-07</w:t>
+            </w:r>
+          </w:p>
+        </w:tc>
+        <w:tc>
+          <w:tcPr>
+            <w:tcW w:w="2271" w:type="dxa"/>
+          </w:tcPr>
+          <w:p>
+            <w:pPr>
+              <w:cnfStyle w:val="000000000000" w:firstRow="0" w:lastRow="0" w:firstColumn="0" w:lastColumn="0" w:oddVBand="0" w:evenVBand="0" w:oddHBand="0" w:evenHBand="0" w:firstRowFirstColumn="0" w:firstRowLastColumn="0" w:lastRowFirstColumn="0" w:lastRowLastColumn="0"/>
+            </w:pPr>
+            <w:r>
+              <w:t>View parking on interactive map</w:t>
+            </w:r>
+          </w:p>
+        </w:tc>
+        <w:tc>
+          <w:tcPr>
+            <w:tcW w:w="2285" w:type="dxa"/>
+          </w:tcPr>
+          <w:p>
+            <w:pPr>
+              <w:cnfStyle w:val="000000000000" w:firstRow="0" w:lastRow="0" w:firstColumn="0" w:lastColumn="0" w:oddVBand="0" w:evenVBand="0" w:oddHBand="0" w:evenHBand="0" w:firstRowFirstColumn="0" w:firstRowLastColumn="0" w:lastRowFirstColumn="0" w:lastRowLastColumn="0"/>
+            </w:pPr>
+            <w:r>
+              <w:t>Driver</w:t>
+            </w:r>
+          </w:p>
+        </w:tc>
+        <w:tc>
+          <w:tcPr>
+            <w:tcW w:w="2591" w:type="dxa"/>
+          </w:tcPr>
+          <w:p>
+            <w:pPr>
+              <w:cnfStyle w:val="000000000000" w:firstRow="0" w:lastRow="0" w:firstColumn="0" w:lastColumn="0" w:oddVBand="0" w:evenVBand="0" w:oddHBand="0" w:evenHBand="0" w:firstRowFirstColumn="0" w:firstRowLastColumn="0" w:lastRowFirstColumn="0" w:lastRowLastColumn="0"/>
+            </w:pPr>
+            <w:r>
+              <w:t>Driver views parking facilities and availability on a map.</w:t>
+            </w:r>
+          </w:p>
+        </w:tc>
+      </w:tr>
+      <w:tr>
+        <w:tc>
+          <w:tcPr>
+            <w:cnfStyle w:val="001000000000" w:firstRow="0" w:lastRow="0" w:firstColumn="1" w:lastColumn="0" w:oddVBand="0" w:evenVBand="0" w:oddHBand="0" w:evenHBand="0" w:firstRowFirstColumn="0" w:firstRowLastColumn="0" w:lastRowFirstColumn="0" w:lastRowLastColumn="0"/>
+            <w:tcW w:w="2203" w:type="dxa"/>
           </w:tcPr>
           <w:p>
             <w:pPr>
@@ -1292,7 +1278,7 @@
         </w:tc>
         <w:tc>
           <w:tcPr>
-            <w:tcW w:w="2337" w:type="dxa"/>
+            <w:tcW w:w="2271" w:type="dxa"/>
           </w:tcPr>
           <w:p>
             <w:pPr>
@@ -1305,7 +1291,7 @@
         </w:tc>
         <w:tc>
           <w:tcPr>
-            <w:tcW w:w="2338" w:type="dxa"/>
+            <w:tcW w:w="2285" w:type="dxa"/>
           </w:tcPr>
           <w:p>
             <w:pPr>
@@ -1318,7 +1304,7 @@
         </w:tc>
         <w:tc>
           <w:tcPr>
-            <w:tcW w:w="2338" w:type="dxa"/>
+            <w:tcW w:w="2591" w:type="dxa"/>
           </w:tcPr>
           <w:p>
             <w:pPr>
@@ -1334,7 +1320,7 @@
         <w:tc>
           <w:tcPr>
             <w:cnfStyle w:val="001000000000" w:firstRow="0" w:lastRow="0" w:firstColumn="1" w:lastColumn="0" w:oddVBand="0" w:evenVBand="0" w:oddHBand="0" w:evenHBand="0" w:firstRowFirstColumn="0" w:firstRowLastColumn="0" w:lastRowFirstColumn="0" w:lastRowLastColumn="0"/>
-            <w:tcW w:w="2337" w:type="dxa"/>
+            <w:tcW w:w="2203" w:type="dxa"/>
           </w:tcPr>
           <w:p>
             <w:pPr>
@@ -1354,7 +1340,7 @@
         </w:tc>
         <w:tc>
           <w:tcPr>
-            <w:tcW w:w="2337" w:type="dxa"/>
+            <w:tcW w:w="2271" w:type="dxa"/>
           </w:tcPr>
           <w:p>
             <w:pPr>
@@ -1367,7 +1353,7 @@
         </w:tc>
         <w:tc>
           <w:tcPr>
-            <w:tcW w:w="2338" w:type="dxa"/>
+            <w:tcW w:w="2285" w:type="dxa"/>
           </w:tcPr>
           <w:p>
             <w:pPr>
@@ -1380,7 +1366,7 @@
         </w:tc>
         <w:tc>
           <w:tcPr>
-            <w:tcW w:w="2338" w:type="dxa"/>
+            <w:tcW w:w="2591" w:type="dxa"/>
           </w:tcPr>
           <w:p>
             <w:pPr>
@@ -1399,7 +1385,7 @@
         <w:tc>
           <w:tcPr>
             <w:cnfStyle w:val="001000000000" w:firstRow="0" w:lastRow="0" w:firstColumn="1" w:lastColumn="0" w:oddVBand="0" w:evenVBand="0" w:oddHBand="0" w:evenHBand="0" w:firstRowFirstColumn="0" w:firstRowLastColumn="0" w:lastRowFirstColumn="0" w:lastRowLastColumn="0"/>
-            <w:tcW w:w="2337" w:type="dxa"/>
+            <w:tcW w:w="2203" w:type="dxa"/>
           </w:tcPr>
           <w:p>
             <w:pPr>
@@ -1419,7 +1405,7 @@
         </w:tc>
         <w:tc>
           <w:tcPr>
-            <w:tcW w:w="2337" w:type="dxa"/>
+            <w:tcW w:w="2271" w:type="dxa"/>
           </w:tcPr>
           <w:p>
             <w:pPr>
@@ -1432,7 +1418,7 @@
         </w:tc>
         <w:tc>
           <w:tcPr>
-            <w:tcW w:w="2338" w:type="dxa"/>
+            <w:tcW w:w="2285" w:type="dxa"/>
           </w:tcPr>
           <w:p>
             <w:pPr>
@@ -1445,7 +1431,7 @@
         </w:tc>
         <w:tc>
           <w:tcPr>
-            <w:tcW w:w="2338" w:type="dxa"/>
+            <w:tcW w:w="2591" w:type="dxa"/>
           </w:tcPr>
           <w:p>
             <w:pPr>
@@ -1461,7 +1447,7 @@
         <w:tc>
           <w:tcPr>
             <w:cnfStyle w:val="001000000000" w:firstRow="0" w:lastRow="0" w:firstColumn="1" w:lastColumn="0" w:oddVBand="0" w:evenVBand="0" w:oddHBand="0" w:evenHBand="0" w:firstRowFirstColumn="0" w:firstRowLastColumn="0" w:lastRowFirstColumn="0" w:lastRowLastColumn="0"/>
-            <w:tcW w:w="2337" w:type="dxa"/>
+            <w:tcW w:w="2203" w:type="dxa"/>
           </w:tcPr>
           <w:p>
             <w:pPr>
@@ -1481,7 +1467,7 @@
         </w:tc>
         <w:tc>
           <w:tcPr>
-            <w:tcW w:w="2337" w:type="dxa"/>
+            <w:tcW w:w="2271" w:type="dxa"/>
           </w:tcPr>
           <w:p>
             <w:pPr>
@@ -1494,7 +1480,7 @@
         </w:tc>
         <w:tc>
           <w:tcPr>
-            <w:tcW w:w="2338" w:type="dxa"/>
+            <w:tcW w:w="2285" w:type="dxa"/>
           </w:tcPr>
           <w:p>
             <w:pPr>
@@ -1507,7 +1493,7 @@
         </w:tc>
         <w:tc>
           <w:tcPr>
-            <w:tcW w:w="2338" w:type="dxa"/>
+            <w:tcW w:w="2591" w:type="dxa"/>
           </w:tcPr>
           <w:p>
             <w:pPr>
@@ -1523,7 +1509,7 @@
         <w:tc>
           <w:tcPr>
             <w:cnfStyle w:val="001000000000" w:firstRow="0" w:lastRow="0" w:firstColumn="1" w:lastColumn="0" w:oddVBand="0" w:evenVBand="0" w:oddHBand="0" w:evenHBand="0" w:firstRowFirstColumn="0" w:firstRowLastColumn="0" w:lastRowFirstColumn="0" w:lastRowLastColumn="0"/>
-            <w:tcW w:w="2337" w:type="dxa"/>
+            <w:tcW w:w="2203" w:type="dxa"/>
           </w:tcPr>
           <w:p>
             <w:pPr>
@@ -1543,7 +1529,7 @@
         </w:tc>
         <w:tc>
           <w:tcPr>
-            <w:tcW w:w="2337" w:type="dxa"/>
+            <w:tcW w:w="2271" w:type="dxa"/>
           </w:tcPr>
           <w:p>
             <w:pPr>
@@ -1556,7 +1542,7 @@
         </w:tc>
         <w:tc>
           <w:tcPr>
-            <w:tcW w:w="2338" w:type="dxa"/>
+            <w:tcW w:w="2285" w:type="dxa"/>
           </w:tcPr>
           <w:p>
             <w:pPr>
@@ -1569,7 +1555,7 @@
         </w:tc>
         <w:tc>
           <w:tcPr>
-            <w:tcW w:w="2338" w:type="dxa"/>
+            <w:tcW w:w="2591" w:type="dxa"/>
           </w:tcPr>
           <w:p>
             <w:pPr>
@@ -1588,7 +1574,7 @@
         <w:tc>
           <w:tcPr>
             <w:cnfStyle w:val="001000000000" w:firstRow="0" w:lastRow="0" w:firstColumn="1" w:lastColumn="0" w:oddVBand="0" w:evenVBand="0" w:oddHBand="0" w:evenHBand="0" w:firstRowFirstColumn="0" w:firstRowLastColumn="0" w:lastRowFirstColumn="0" w:lastRowLastColumn="0"/>
-            <w:tcW w:w="2337" w:type="dxa"/>
+            <w:tcW w:w="2203" w:type="dxa"/>
           </w:tcPr>
           <w:p>
             <w:pPr>
@@ -1608,7 +1594,7 @@
         </w:tc>
         <w:tc>
           <w:tcPr>
-            <w:tcW w:w="2337" w:type="dxa"/>
+            <w:tcW w:w="2271" w:type="dxa"/>
           </w:tcPr>
           <w:p>
             <w:pPr>
@@ -1621,7 +1607,7 @@
         </w:tc>
         <w:tc>
           <w:tcPr>
-            <w:tcW w:w="2338" w:type="dxa"/>
+            <w:tcW w:w="2285" w:type="dxa"/>
           </w:tcPr>
           <w:p>
             <w:pPr>
@@ -1634,7 +1620,7 @@
         </w:tc>
         <w:tc>
           <w:tcPr>
-            <w:tcW w:w="2338" w:type="dxa"/>
+            <w:tcW w:w="2591" w:type="dxa"/>
           </w:tcPr>
           <w:p>
             <w:pPr>
@@ -1650,7 +1636,7 @@
         <w:tc>
           <w:tcPr>
             <w:cnfStyle w:val="001000000000" w:firstRow="0" w:lastRow="0" w:firstColumn="1" w:lastColumn="0" w:oddVBand="0" w:evenVBand="0" w:oddHBand="0" w:evenHBand="0" w:firstRowFirstColumn="0" w:firstRowLastColumn="0" w:lastRowFirstColumn="0" w:lastRowLastColumn="0"/>
-            <w:tcW w:w="2337" w:type="dxa"/>
+            <w:tcW w:w="2203" w:type="dxa"/>
           </w:tcPr>
           <w:p>
             <w:pPr>
@@ -1670,7 +1656,7 @@
         </w:tc>
         <w:tc>
           <w:tcPr>
-            <w:tcW w:w="2337" w:type="dxa"/>
+            <w:tcW w:w="2271" w:type="dxa"/>
           </w:tcPr>
           <w:p>
             <w:pPr>
@@ -1683,7 +1669,7 @@
         </w:tc>
         <w:tc>
           <w:tcPr>
-            <w:tcW w:w="2338" w:type="dxa"/>
+            <w:tcW w:w="2285" w:type="dxa"/>
           </w:tcPr>
           <w:p>
             <w:pPr>
@@ -1696,7 +1682,7 @@
         </w:tc>
         <w:tc>
           <w:tcPr>
-            <w:tcW w:w="2338" w:type="dxa"/>
+            <w:tcW w:w="2591" w:type="dxa"/>
           </w:tcPr>
           <w:p>
             <w:pPr>
@@ -1712,7 +1698,7 @@
         <w:tc>
           <w:tcPr>
             <w:cnfStyle w:val="001000000000" w:firstRow="0" w:lastRow="0" w:firstColumn="1" w:lastColumn="0" w:oddVBand="0" w:evenVBand="0" w:oddHBand="0" w:evenHBand="0" w:firstRowFirstColumn="0" w:firstRowLastColumn="0" w:lastRowFirstColumn="0" w:lastRowLastColumn="0"/>
-            <w:tcW w:w="2337" w:type="dxa"/>
+            <w:tcW w:w="2203" w:type="dxa"/>
           </w:tcPr>
           <w:p>
             <w:pPr>
@@ -1732,7 +1718,7 @@
         </w:tc>
         <w:tc>
           <w:tcPr>
-            <w:tcW w:w="2337" w:type="dxa"/>
+            <w:tcW w:w="2271" w:type="dxa"/>
           </w:tcPr>
           <w:p>
             <w:pPr>
@@ -1745,7 +1731,7 @@
         </w:tc>
         <w:tc>
           <w:tcPr>
-            <w:tcW w:w="2338" w:type="dxa"/>
+            <w:tcW w:w="2285" w:type="dxa"/>
           </w:tcPr>
           <w:p>
             <w:pPr>
@@ -1758,7 +1744,7 @@
         </w:tc>
         <w:tc>
           <w:tcPr>
-            <w:tcW w:w="2338" w:type="dxa"/>
+            <w:tcW w:w="2591" w:type="dxa"/>
           </w:tcPr>
           <w:p>
             <w:pPr>
@@ -1766,6 +1752,445 @@
             </w:pPr>
             <w:r>
               <w:t>Authorized personnel manage an eligible customer refund.</w:t>
+            </w:r>
+          </w:p>
+        </w:tc>
+      </w:tr>
+      <w:tr>
+        <w:tc>
+          <w:tcPr>
+            <w:cnfStyle w:val="001000000000" w:firstRow="0" w:lastRow="0" w:firstColumn="1" w:lastColumn="0" w:oddVBand="0" w:evenVBand="0" w:oddHBand="0" w:evenHBand="0" w:firstRowFirstColumn="0" w:firstRowLastColumn="0" w:lastRowFirstColumn="0" w:lastRowLastColumn="0"/>
+            <w:tcW w:w="2203" w:type="dxa"/>
+          </w:tcPr>
+          <w:p>
+            <w:pPr>
+              <w:rPr>
+                <w:b w:val="0"/>
+                <w:bCs w:val="0"/>
+              </w:rPr>
+            </w:pPr>
+            <w:r>
+              <w:rPr>
+                <w:b w:val="0"/>
+                <w:bCs w:val="0"/>
+              </w:rPr>
+              <w:t>UC-16</w:t>
+            </w:r>
+          </w:p>
+        </w:tc>
+        <w:tc>
+          <w:tcPr>
+            <w:tcW w:w="2271" w:type="dxa"/>
+          </w:tcPr>
+          <w:p>
+            <w:pPr>
+              <w:cnfStyle w:val="000000000000" w:firstRow="0" w:lastRow="0" w:firstColumn="0" w:lastColumn="0" w:oddVBand="0" w:evenVBand="0" w:oddHBand="0" w:evenHBand="0" w:firstRowFirstColumn="0" w:firstRowLastColumn="0" w:lastRowFirstColumn="0" w:lastRowLastColumn="0"/>
+            </w:pPr>
+            <w:r>
+              <w:t>Process parking payment</w:t>
+            </w:r>
+          </w:p>
+        </w:tc>
+        <w:tc>
+          <w:tcPr>
+            <w:tcW w:w="2285" w:type="dxa"/>
+          </w:tcPr>
+          <w:p>
+            <w:pPr>
+              <w:cnfStyle w:val="000000000000" w:firstRow="0" w:lastRow="0" w:firstColumn="0" w:lastColumn="0" w:oddVBand="0" w:evenVBand="0" w:oddHBand="0" w:evenHBand="0" w:firstRowFirstColumn="0" w:firstRowLastColumn="0" w:lastRowFirstColumn="0" w:lastRowLastColumn="0"/>
+            </w:pPr>
+            <w:r>
+              <w:t>Driver</w:t>
+            </w:r>
+          </w:p>
+        </w:tc>
+        <w:tc>
+          <w:tcPr>
+            <w:tcW w:w="2591" w:type="dxa"/>
+          </w:tcPr>
+          <w:p>
+            <w:pPr>
+              <w:cnfStyle w:val="000000000000" w:firstRow="0" w:lastRow="0" w:firstColumn="0" w:lastColumn="0" w:oddVBand="0" w:evenVBand="0" w:oddHBand="0" w:evenHBand="0" w:firstRowFirstColumn="0" w:firstRowLastColumn="0" w:lastRowFirstColumn="0" w:lastRowLastColumn="0"/>
+            </w:pPr>
+            <w:r>
+              <w:t>Driver securely pays for a parking reservation through an integrated payment provider.</w:t>
+            </w:r>
+          </w:p>
+        </w:tc>
+      </w:tr>
+      <w:tr>
+        <w:tc>
+          <w:tcPr>
+            <w:cnfStyle w:val="001000000000" w:firstRow="0" w:lastRow="0" w:firstColumn="1" w:lastColumn="0" w:oddVBand="0" w:evenVBand="0" w:oddHBand="0" w:evenHBand="0" w:firstRowFirstColumn="0" w:firstRowLastColumn="0" w:lastRowFirstColumn="0" w:lastRowLastColumn="0"/>
+            <w:tcW w:w="2203" w:type="dxa"/>
+          </w:tcPr>
+          <w:p>
+            <w:pPr>
+              <w:rPr>
+                <w:b w:val="0"/>
+                <w:bCs w:val="0"/>
+              </w:rPr>
+            </w:pPr>
+            <w:r>
+              <w:rPr>
+                <w:b w:val="0"/>
+                <w:bCs w:val="0"/>
+              </w:rPr>
+              <w:t>UC-17</w:t>
+            </w:r>
+          </w:p>
+        </w:tc>
+        <w:tc>
+          <w:tcPr>
+            <w:tcW w:w="2271" w:type="dxa"/>
+          </w:tcPr>
+          <w:p>
+            <w:pPr>
+              <w:cnfStyle w:val="000000000000" w:firstRow="0" w:lastRow="0" w:firstColumn="0" w:lastColumn="0" w:oddVBand="0" w:evenVBand="0" w:oddHBand="0" w:evenHBand="0" w:firstRowFirstColumn="0" w:firstRowLastColumn="0" w:lastRowFirstColumn="0" w:lastRowLastColumn="0"/>
+            </w:pPr>
+            <w:r>
+              <w:t>View reservation history and receipts</w:t>
+            </w:r>
+          </w:p>
+        </w:tc>
+        <w:tc>
+          <w:tcPr>
+            <w:tcW w:w="2285" w:type="dxa"/>
+          </w:tcPr>
+          <w:p>
+            <w:pPr>
+              <w:cnfStyle w:val="000000000000" w:firstRow="0" w:lastRow="0" w:firstColumn="0" w:lastColumn="0" w:oddVBand="0" w:evenVBand="0" w:oddHBand="0" w:evenHBand="0" w:firstRowFirstColumn="0" w:firstRowLastColumn="0" w:lastRowFirstColumn="0" w:lastRowLastColumn="0"/>
+            </w:pPr>
+            <w:r>
+              <w:t>Driver</w:t>
+            </w:r>
+          </w:p>
+        </w:tc>
+        <w:tc>
+          <w:tcPr>
+            <w:tcW w:w="2591" w:type="dxa"/>
+          </w:tcPr>
+          <w:p>
+            <w:pPr>
+              <w:cnfStyle w:val="000000000000" w:firstRow="0" w:lastRow="0" w:firstColumn="0" w:lastColumn="0" w:oddVBand="0" w:evenVBand="0" w:oddHBand="0" w:evenHBand="0" w:firstRowFirstColumn="0" w:firstRowLastColumn="0" w:lastRowFirstColumn="0" w:lastRowLastColumn="0"/>
+            </w:pPr>
+            <w:r>
+              <w:t>Driver accesses previous reservations, payment history, and digital receipts.</w:t>
+            </w:r>
+          </w:p>
+        </w:tc>
+      </w:tr>
+      <w:tr>
+        <w:tc>
+          <w:tcPr>
+            <w:cnfStyle w:val="001000000000" w:firstRow="0" w:lastRow="0" w:firstColumn="1" w:lastColumn="0" w:oddVBand="0" w:evenVBand="0" w:oddHBand="0" w:evenHBand="0" w:firstRowFirstColumn="0" w:firstRowLastColumn="0" w:lastRowFirstColumn="0" w:lastRowLastColumn="0"/>
+            <w:tcW w:w="2203" w:type="dxa"/>
+          </w:tcPr>
+          <w:p>
+            <w:pPr>
+              <w:rPr>
+                <w:b w:val="0"/>
+                <w:bCs w:val="0"/>
+              </w:rPr>
+            </w:pPr>
+            <w:r>
+              <w:rPr>
+                <w:b w:val="0"/>
+                <w:bCs w:val="0"/>
+              </w:rPr>
+              <w:t>UC-18</w:t>
+            </w:r>
+          </w:p>
+        </w:tc>
+        <w:tc>
+          <w:tcPr>
+            <w:tcW w:w="2271" w:type="dxa"/>
+          </w:tcPr>
+          <w:p>
+            <w:pPr>
+              <w:cnfStyle w:val="000000000000" w:firstRow="0" w:lastRow="0" w:firstColumn="0" w:lastColumn="0" w:oddVBand="0" w:evenVBand="0" w:oddHBand="0" w:evenHBand="0" w:firstRowFirstColumn="0" w:firstRowLastColumn="0" w:lastRowFirstColumn="0" w:lastRowLastColumn="0"/>
+            </w:pPr>
+            <w:r>
+              <w:t>Receive navigation assistance</w:t>
+            </w:r>
+          </w:p>
+        </w:tc>
+        <w:tc>
+          <w:tcPr>
+            <w:tcW w:w="2285" w:type="dxa"/>
+          </w:tcPr>
+          <w:p>
+            <w:pPr>
+              <w:cnfStyle w:val="000000000000" w:firstRow="0" w:lastRow="0" w:firstColumn="0" w:lastColumn="0" w:oddVBand="0" w:evenVBand="0" w:oddHBand="0" w:evenHBand="0" w:firstRowFirstColumn="0" w:firstRowLastColumn="0" w:lastRowFirstColumn="0" w:lastRowLastColumn="0"/>
+            </w:pPr>
+            <w:r>
+              <w:t>Driver</w:t>
+            </w:r>
+          </w:p>
+        </w:tc>
+        <w:tc>
+          <w:tcPr>
+            <w:tcW w:w="2591" w:type="dxa"/>
+          </w:tcPr>
+          <w:p>
+            <w:pPr>
+              <w:cnfStyle w:val="000000000000" w:firstRow="0" w:lastRow="0" w:firstColumn="0" w:lastColumn="0" w:oddVBand="0" w:evenVBand="0" w:oddHBand="0" w:evenHBand="0" w:firstRowFirstColumn="0" w:firstRowLastColumn="0" w:lastRowFirstColumn="0" w:lastRowLastColumn="0"/>
+            </w:pPr>
+            <w:r>
+              <w:t xml:space="preserve">Driver receives directions to a selected parking facility through </w:t>
+            </w:r>
+            <w:r>
+              <w:lastRenderedPageBreak/>
+              <w:t>integrated mapping services.</w:t>
+            </w:r>
+          </w:p>
+        </w:tc>
+      </w:tr>
+      <w:tr>
+        <w:tc>
+          <w:tcPr>
+            <w:cnfStyle w:val="001000000000" w:firstRow="0" w:lastRow="0" w:firstColumn="1" w:lastColumn="0" w:oddVBand="0" w:evenVBand="0" w:oddHBand="0" w:evenHBand="0" w:firstRowFirstColumn="0" w:firstRowLastColumn="0" w:lastRowFirstColumn="0" w:lastRowLastColumn="0"/>
+            <w:tcW w:w="2203" w:type="dxa"/>
+          </w:tcPr>
+          <w:p>
+            <w:pPr>
+              <w:rPr>
+                <w:b w:val="0"/>
+                <w:bCs w:val="0"/>
+              </w:rPr>
+            </w:pPr>
+            <w:r>
+              <w:rPr>
+                <w:b w:val="0"/>
+                <w:bCs w:val="0"/>
+              </w:rPr>
+              <w:lastRenderedPageBreak/>
+              <w:t>UC-19</w:t>
+            </w:r>
+          </w:p>
+        </w:tc>
+        <w:tc>
+          <w:tcPr>
+            <w:tcW w:w="2271" w:type="dxa"/>
+          </w:tcPr>
+          <w:p>
+            <w:pPr>
+              <w:cnfStyle w:val="000000000000" w:firstRow="0" w:lastRow="0" w:firstColumn="0" w:lastColumn="0" w:oddVBand="0" w:evenVBand="0" w:oddHBand="0" w:evenHBand="0" w:firstRowFirstColumn="0" w:firstRowLastColumn="0" w:lastRowFirstColumn="0" w:lastRowLastColumn="0"/>
+            </w:pPr>
+            <w:r>
+              <w:t>Receive notifications and alerts</w:t>
+            </w:r>
+          </w:p>
+        </w:tc>
+        <w:tc>
+          <w:tcPr>
+            <w:tcW w:w="2285" w:type="dxa"/>
+          </w:tcPr>
+          <w:p>
+            <w:pPr>
+              <w:cnfStyle w:val="000000000000" w:firstRow="0" w:lastRow="0" w:firstColumn="0" w:lastColumn="0" w:oddVBand="0" w:evenVBand="0" w:oddHBand="0" w:evenHBand="0" w:firstRowFirstColumn="0" w:firstRowLastColumn="0" w:lastRowFirstColumn="0" w:lastRowLastColumn="0"/>
+            </w:pPr>
+            <w:r>
+              <w:t>Driver</w:t>
+            </w:r>
+          </w:p>
+        </w:tc>
+        <w:tc>
+          <w:tcPr>
+            <w:tcW w:w="2591" w:type="dxa"/>
+          </w:tcPr>
+          <w:p>
+            <w:pPr>
+              <w:cnfStyle w:val="000000000000" w:firstRow="0" w:lastRow="0" w:firstColumn="0" w:lastColumn="0" w:oddVBand="0" w:evenVBand="0" w:oddHBand="0" w:evenHBand="0" w:firstRowFirstColumn="0" w:firstRowLastColumn="0" w:lastRowFirstColumn="0" w:lastRowLastColumn="0"/>
+            </w:pPr>
+            <w:r>
+              <w:t>Driver receives reservation confirmations, reminders, and relevant parking updates.</w:t>
+            </w:r>
+          </w:p>
+        </w:tc>
+      </w:tr>
+      <w:tr>
+        <w:tc>
+          <w:tcPr>
+            <w:cnfStyle w:val="001000000000" w:firstRow="0" w:lastRow="0" w:firstColumn="1" w:lastColumn="0" w:oddVBand="0" w:evenVBand="0" w:oddHBand="0" w:evenHBand="0" w:firstRowFirstColumn="0" w:firstRowLastColumn="0" w:lastRowFirstColumn="0" w:lastRowLastColumn="0"/>
+            <w:tcW w:w="2203" w:type="dxa"/>
+          </w:tcPr>
+          <w:p>
+            <w:pPr>
+              <w:rPr>
+                <w:b w:val="0"/>
+                <w:bCs w:val="0"/>
+              </w:rPr>
+            </w:pPr>
+            <w:r>
+              <w:rPr>
+                <w:b w:val="0"/>
+                <w:bCs w:val="0"/>
+              </w:rPr>
+              <w:t>UC-20</w:t>
+            </w:r>
+          </w:p>
+        </w:tc>
+        <w:tc>
+          <w:tcPr>
+            <w:tcW w:w="2271" w:type="dxa"/>
+          </w:tcPr>
+          <w:p>
+            <w:pPr>
+              <w:cnfStyle w:val="000000000000" w:firstRow="0" w:lastRow="0" w:firstColumn="0" w:lastColumn="0" w:oddVBand="0" w:evenVBand="0" w:oddHBand="0" w:evenHBand="0" w:firstRowFirstColumn="0" w:firstRowLastColumn="0" w:lastRowFirstColumn="0" w:lastRowLastColumn="0"/>
+            </w:pPr>
+            <w:r>
+              <w:t>Manage facility pricing</w:t>
+            </w:r>
+          </w:p>
+        </w:tc>
+        <w:tc>
+          <w:tcPr>
+            <w:tcW w:w="2285" w:type="dxa"/>
+          </w:tcPr>
+          <w:p>
+            <w:pPr>
+              <w:cnfStyle w:val="000000000000" w:firstRow="0" w:lastRow="0" w:firstColumn="0" w:lastColumn="0" w:oddVBand="0" w:evenVBand="0" w:oddHBand="0" w:evenHBand="0" w:firstRowFirstColumn="0" w:firstRowLastColumn="0" w:lastRowFirstColumn="0" w:lastRowLastColumn="0"/>
+            </w:pPr>
+            <w:r>
+              <w:t>Parking operator</w:t>
+            </w:r>
+          </w:p>
+        </w:tc>
+        <w:tc>
+          <w:tcPr>
+            <w:tcW w:w="2591" w:type="dxa"/>
+          </w:tcPr>
+          <w:p>
+            <w:pPr>
+              <w:cnfStyle w:val="000000000000" w:firstRow="0" w:lastRow="0" w:firstColumn="0" w:lastColumn="0" w:oddVBand="0" w:evenVBand="0" w:oddHBand="0" w:evenHBand="0" w:firstRowFirstColumn="0" w:firstRowLastColumn="0" w:lastRowFirstColumn="0" w:lastRowLastColumn="0"/>
+            </w:pPr>
+            <w:r>
+              <w:t>Operator sets or updates parking rates and pricing information.</w:t>
+            </w:r>
+          </w:p>
+        </w:tc>
+      </w:tr>
+      <w:tr>
+        <w:tc>
+          <w:tcPr>
+            <w:cnfStyle w:val="001000000000" w:firstRow="0" w:lastRow="0" w:firstColumn="1" w:lastColumn="0" w:oddVBand="0" w:evenVBand="0" w:oddHBand="0" w:evenHBand="0" w:firstRowFirstColumn="0" w:firstRowLastColumn="0" w:lastRowFirstColumn="0" w:lastRowLastColumn="0"/>
+            <w:tcW w:w="2203" w:type="dxa"/>
+          </w:tcPr>
+          <w:p>
+            <w:pPr>
+              <w:rPr>
+                <w:b w:val="0"/>
+                <w:bCs w:val="0"/>
+              </w:rPr>
+            </w:pPr>
+            <w:r>
+              <w:rPr>
+                <w:b w:val="0"/>
+                <w:bCs w:val="0"/>
+              </w:rPr>
+              <w:t>UC-21</w:t>
+            </w:r>
+          </w:p>
+        </w:tc>
+        <w:tc>
+          <w:tcPr>
+            <w:tcW w:w="2271" w:type="dxa"/>
+          </w:tcPr>
+          <w:p>
+            <w:pPr>
+              <w:cnfStyle w:val="000000000000" w:firstRow="0" w:lastRow="0" w:firstColumn="0" w:lastColumn="0" w:oddVBand="0" w:evenVBand="0" w:oddHBand="0" w:evenHBand="0" w:firstRowFirstColumn="0" w:firstRowLastColumn="0" w:lastRowFirstColumn="0" w:lastRowLastColumn="0"/>
+            </w:pPr>
+            <w:r>
+              <w:t>Monitor real-time occupancy</w:t>
+            </w:r>
+          </w:p>
+        </w:tc>
+        <w:tc>
+          <w:tcPr>
+            <w:tcW w:w="2285" w:type="dxa"/>
+          </w:tcPr>
+          <w:p>
+            <w:pPr>
+              <w:cnfStyle w:val="000000000000" w:firstRow="0" w:lastRow="0" w:firstColumn="0" w:lastColumn="0" w:oddVBand="0" w:evenVBand="0" w:oddHBand="0" w:evenHBand="0" w:firstRowFirstColumn="0" w:firstRowLastColumn="0" w:lastRowFirstColumn="0" w:lastRowLastColumn="0"/>
+            </w:pPr>
+            <w:r>
+              <w:t>Parking operator</w:t>
+            </w:r>
+          </w:p>
+        </w:tc>
+        <w:tc>
+          <w:tcPr>
+            <w:tcW w:w="2591" w:type="dxa"/>
+          </w:tcPr>
+          <w:p>
+            <w:pPr>
+              <w:cnfStyle w:val="000000000000" w:firstRow="0" w:lastRow="0" w:firstColumn="0" w:lastColumn="0" w:oddVBand="0" w:evenVBand="0" w:oddHBand="0" w:evenHBand="0" w:firstRowFirstColumn="0" w:firstRowLastColumn="0" w:lastRowFirstColumn="0" w:lastRowLastColumn="0"/>
+            </w:pPr>
+            <w:r>
+              <w:t>Operator monitors current facility occupancy and available parking capacity.</w:t>
+            </w:r>
+          </w:p>
+        </w:tc>
+      </w:tr>
+      <w:tr>
+        <w:tc>
+          <w:tcPr>
+            <w:cnfStyle w:val="001000000000" w:firstRow="0" w:lastRow="0" w:firstColumn="1" w:lastColumn="0" w:oddVBand="0" w:evenVBand="0" w:oddHBand="0" w:evenHBand="0" w:firstRowFirstColumn="0" w:firstRowLastColumn="0" w:lastRowFirstColumn="0" w:lastRowLastColumn="0"/>
+            <w:tcW w:w="2203" w:type="dxa"/>
+          </w:tcPr>
+          <w:p>
+            <w:pPr>
+              <w:rPr>
+                <w:b w:val="0"/>
+                <w:bCs w:val="0"/>
+              </w:rPr>
+            </w:pPr>
+            <w:r>
+              <w:rPr>
+                <w:b w:val="0"/>
+                <w:bCs w:val="0"/>
+              </w:rPr>
+              <w:t>UC-22</w:t>
+            </w:r>
+          </w:p>
+        </w:tc>
+        <w:tc>
+          <w:tcPr>
+            <w:tcW w:w="2271" w:type="dxa"/>
+          </w:tcPr>
+          <w:p>
+            <w:pPr>
+              <w:cnfStyle w:val="000000000000" w:firstRow="0" w:lastRow="0" w:firstColumn="0" w:lastColumn="0" w:oddVBand="0" w:evenVBand="0" w:oddHBand="0" w:evenHBand="0" w:firstRowFirstColumn="0" w:firstRowLastColumn="0" w:lastRowFirstColumn="0" w:lastRowLastColumn="0"/>
+            </w:pPr>
+            <w:r>
+              <w:t>Manage garage availability</w:t>
+            </w:r>
+          </w:p>
+        </w:tc>
+        <w:tc>
+          <w:tcPr>
+            <w:tcW w:w="2285" w:type="dxa"/>
+          </w:tcPr>
+          <w:p>
+            <w:pPr>
+              <w:cnfStyle w:val="000000000000" w:firstRow="0" w:lastRow="0" w:firstColumn="0" w:lastColumn="0" w:oddVBand="0" w:evenVBand="0" w:oddHBand="0" w:evenHBand="0" w:firstRowFirstColumn="0" w:firstRowLastColumn="0" w:lastRowFirstColumn="0" w:lastRowLastColumn="0"/>
+            </w:pPr>
+            <w:r>
+              <w:t>Parking operator</w:t>
+            </w:r>
+          </w:p>
+        </w:tc>
+        <w:tc>
+          <w:tcPr>
+            <w:tcW w:w="2591" w:type="dxa"/>
+          </w:tcPr>
+          <w:p>
+            <w:pPr>
+              <w:cnfStyle w:val="000000000000" w:firstRow="0" w:lastRow="0" w:firstColumn="0" w:lastColumn="0" w:oddVBand="0" w:evenVBand="0" w:oddHBand="0" w:evenHBand="0" w:firstRowFirstColumn="0" w:firstRowLastColumn="0" w:lastRowFirstColumn="0" w:lastRowLastColumn="0"/>
+            </w:pPr>
+            <w:r>
+              <w:t>Operator updates parking availability, capacity, and relevant facility status information.</w:t>
             </w:r>
           </w:p>
         </w:tc>
@@ -1789,37 +2214,104 @@
     </w:p>
     <w:p>
       <w:r>
-        <w:t xml:space="preserve">We can </w:t>
-      </w:r>
-      <w:r>
-        <w:t xml:space="preserve">establish some initial nonfunctional requirements </w:t>
-      </w:r>
-      <w:r>
-        <w:t>without getting</w:t>
-      </w:r>
-      <w:r>
-        <w:t xml:space="preserve"> too specific</w:t>
-      </w:r>
-      <w:r>
-        <w:t>. The platform will protect sensitive user and payment information</w:t>
-      </w:r>
-      <w:r>
-        <w:t xml:space="preserve">, support secure authentication and authorization, provide usable interfaces </w:t>
-      </w:r>
-      <w:r>
-        <w:t>on</w:t>
-      </w:r>
-      <w:r>
-        <w:t xml:space="preserve"> supported devices, maintain reliable communication with</w:t>
-      </w:r>
-      <w:r>
-        <w:t xml:space="preserve"> required </w:t>
-      </w:r>
-      <w:r>
-        <w:t>third parties</w:t>
-      </w:r>
-      <w:r>
-        <w:t>, and comply with privacy, security, city, and legal requirements.</w:t>
+        <w:t>The Smart Parking Platform must meet the following nonfunctional requirements to ensure the system is secure, reliable, accessible, and capable of supporting its intended users.</w:t>
+      </w:r>
+    </w:p>
+    <w:p>
+      <w:r>
+        <w:rPr>
+          <w:b/>
+          <w:bCs/>
+        </w:rPr>
+        <w:t>Security:</w:t>
+      </w:r>
+      <w:r>
+        <w:t xml:space="preserve"> The platform must use secure authentication and role-based authorization to protect user and operator accounts. Sensitive personal and payment information must be protected through appropriate encryption and secure data handling practices.</w:t>
+      </w:r>
+    </w:p>
+    <w:p>
+      <w:r>
+        <w:rPr>
+          <w:b/>
+          <w:bCs/>
+        </w:rPr>
+        <w:t>Performance:</w:t>
+      </w:r>
+      <w:r>
+        <w:t xml:space="preserve"> The platform should provide responsive searching, reservation processing, and availability updates. System performance should remain consistent under expected levels of user activity.</w:t>
+      </w:r>
+    </w:p>
+    <w:p>
+      <w:r>
+        <w:rPr>
+          <w:b/>
+          <w:bCs/>
+        </w:rPr>
+        <w:t>Reliability and Availability:</w:t>
+      </w:r>
+      <w:r>
+        <w:t xml:space="preserve"> The platform should maintain reliable access to parking information and reservation services. Appropriate error handling and recovery mechanisms should minimize disruptions caused by system failures or unavailable external services.</w:t>
+      </w:r>
+    </w:p>
+    <w:p>
+      <w:r>
+        <w:rPr>
+          <w:b/>
+          <w:bCs/>
+        </w:rPr>
+        <w:t>Usability:</w:t>
+      </w:r>
+      <w:r>
+        <w:t xml:space="preserve"> Web and mobile interfaces should be intuitive and accessible to users with varying levels of technical experience. Drivers should be able to locate, reserve, and pay for parking with minimal unnecessary steps.</w:t>
+      </w:r>
+    </w:p>
+    <w:p>
+      <w:r>
+        <w:rPr>
+          <w:b/>
+          <w:bCs/>
+        </w:rPr>
+        <w:t>Scalability:</w:t>
+      </w:r>
+      <w:r>
+        <w:t xml:space="preserve"> The system should support increasing numbers of users, parking facilities, and reservations without requiring major architectural changes.</w:t>
+      </w:r>
+    </w:p>
+    <w:p>
+      <w:r>
+        <w:rPr>
+          <w:b/>
+          <w:bCs/>
+        </w:rPr>
+        <w:lastRenderedPageBreak/>
+        <w:t>Compatibility and Integration:</w:t>
+      </w:r>
+      <w:r>
+        <w:t xml:space="preserve"> The platform must support its intended web and mobile environments and communicate reliably with third-party mapping, navigation, and payment services.</w:t>
+      </w:r>
+    </w:p>
+    <w:p>
+      <w:r>
+        <w:rPr>
+          <w:b/>
+          <w:bCs/>
+        </w:rPr>
+        <w:t>Compliance and Privacy:</w:t>
+      </w:r>
+      <w:r>
+        <w:t xml:space="preserve"> The platform must comply with applicable privacy, security, payment processing, and local parking regulations. User information should only be accessible to authorized individuals and systems.</w:t>
+      </w:r>
+    </w:p>
+    <w:p/>
+    <w:p>
+      <w:r>
+        <w:t>*</w:t>
+      </w:r>
+      <w:r>
+        <w:t>*</w:t>
+      </w:r>
+      <w:r>
+        <w:t>*SRS Revision Note: The Software Requirements Specification has been refined to reflect the project's expanded planning activities. Seven additional use cases have been identified to address payment processing, reservation history, navigation, notifications, facility pricing, and occupancy management. Nonfunctional requirements have also been organized into distinct categories to improve clarity and support future validation. These updates maintain alignment between the project scope, Work Breakdown Structure, and product backlog.</w:t>
       </w:r>
     </w:p>
     <w:sectPr>

</xml_diff>